<commit_message>
Códigos de adesão dos fornecedores: desconto na comissão do pintor, comissão do fornecedor, espaço do fornecedor, backoffice e avisos
Co-Authored-By: Claude Sonnet 5.5 <noreply@anthropic.com>
Claude-Session: https://claude.ai/code/session_01SPDKY3VBD8WnLPQg8GohVX
</commit_message>
<xml_diff>
--- a/docs/advogado/Pedido_ronda2_2026-10-21.docx
+++ b/docs/advogado/Pedido_ronda2_2026-10-21.docx
@@ -1289,12 +1289,181 @@
       </w:r>
     </w:p>
     <w:bookmarkEnd w:id="26"/>
-    <w:bookmarkStart w:id="27" w:name="assinatura"/>
+    <w:bookmarkStart w:id="27" w:name="X9cd7da7d581fea95830f60938eae0b5ed035218"/>
     <w:p>
       <w:pPr>
         <w:pStyle w:val="Heading1"/>
       </w:pPr>
       <w:r>
+        <w:t xml:space="preserve">6-A. Comissão de adesão paga a fornecedores de tintas</w:t>
+      </w:r>
+    </w:p>
+    <w:p>
+      <w:pPr>
+        <w:pStyle w:val="FirstParagraph"/>
+      </w:pPr>
+      <w:r>
+        <w:rPr>
+          <w:bCs/>
+          <w:b/>
+        </w:rPr>
+        <w:t xml:space="preserve">O que fizemos.</w:t>
+      </w:r>
+      <w:r>
+        <w:t xml:space="preserve"> </w:t>
+      </w:r>
+      <w:r>
+        <w:t xml:space="preserve">Um fornecedor de tintas pode dar um código a um pintor. Se o pintor o aplicar ao orçamento e ganhar a obra:</w:t>
+      </w:r>
+      <w:r>
+        <w:t xml:space="preserve"> </w:t>
+      </w:r>
+      <w:r>
+        <w:t xml:space="preserve">(i) a comissão que paga à plataforma desce 0,25 pontos percentuais (de 3% para 2,75% do valor sem IVA); (ii) o fornecedor recebe</w:t>
+      </w:r>
+      <w:r>
+        <w:t xml:space="preserve"> </w:t>
+      </w:r>
+      <w:r>
+        <w:t xml:space="preserve">da plataforma 0,25% do valor sem IVA da obra, mais IVA se o cobrar, depois de a plataforma receber a comissão do pintor e contra</w:t>
+      </w:r>
+      <w:r>
+        <w:t xml:space="preserve"> </w:t>
+      </w:r>
+      <w:r>
+        <w:t xml:space="preserve">fatura do fornecedor, por transferência bancária. O cliente não vê nada disto.</w:t>
+      </w:r>
+    </w:p>
+    <w:p>
+      <w:pPr>
+        <w:pStyle w:val="BodyText"/>
+      </w:pPr>
+      <w:r>
+        <w:rPr>
+          <w:bCs/>
+          <w:b/>
+        </w:rPr>
+        <w:t xml:space="preserve">Risco.</w:t>
+      </w:r>
+      <w:r>
+        <w:t xml:space="preserve"> </w:t>
+      </w:r>
+      <w:r>
+        <w:t xml:space="preserve">(a) O pintor pode ser levado a comprar ao fornecedor que lhe deu o código, e o cliente não sabe; os materiais</w:t>
+      </w:r>
+      <w:r>
+        <w:t xml:space="preserve"> </w:t>
+      </w:r>
+      <w:r>
+        <w:t xml:space="preserve">sugeridos e o</w:t>
+      </w:r>
+      <w:r>
+        <w:t xml:space="preserve"> </w:t>
+      </w:r>
+      <w:r>
+        <w:t xml:space="preserve">“</w:t>
+      </w:r>
+      <w:r>
+        <w:t xml:space="preserve">material comprometido</w:t>
+      </w:r>
+      <w:r>
+        <w:t xml:space="preserve">”</w:t>
+      </w:r>
+      <w:r>
+        <w:t xml:space="preserve"> </w:t>
+      </w:r>
+      <w:r>
+        <w:t xml:space="preserve">têm de continuar neutros (F2/G2). (b) Natureza da remuneração (angariação de clientes, mediação, comissão</w:t>
+      </w:r>
+      <w:r>
+        <w:t xml:space="preserve"> </w:t>
+      </w:r>
+      <w:r>
+        <w:t xml:space="preserve">de indicação) e deveres de informação. (c) Tratamento fiscal e de faturação. (d) O fornecedor sabe que o pintor concorreu a uma obra num concelho.</w:t>
+      </w:r>
+    </w:p>
+    <w:p>
+      <w:pPr>
+        <w:pStyle w:val="BodyText"/>
+      </w:pPr>
+      <w:r>
+        <w:rPr>
+          <w:bCs/>
+          <w:b/>
+        </w:rPr>
+        <w:t xml:space="preserve">Perguntas.</w:t>
+      </w:r>
+    </w:p>
+    <w:p>
+      <w:pPr>
+        <w:numPr>
+          <w:ilvl w:val="0"/>
+          <w:numId w:val="1007"/>
+        </w:numPr>
+        <w:pStyle w:val="Compact"/>
+      </w:pPr>
+      <w:r>
+        <w:t xml:space="preserve">Esta comissão exige divulgação ao cliente consumidor ou na página Transparência?</w:t>
+      </w:r>
+    </w:p>
+    <w:p>
+      <w:pPr>
+        <w:numPr>
+          <w:ilvl w:val="0"/>
+          <w:numId w:val="1007"/>
+        </w:numPr>
+        <w:pStyle w:val="Compact"/>
+      </w:pPr>
+      <w:r>
+        <w:t xml:space="preserve">Há conflito com a neutralidade das sugestões de produtos e do</w:t>
+      </w:r>
+      <w:r>
+        <w:t xml:space="preserve"> </w:t>
+      </w:r>
+      <w:r>
+        <w:t xml:space="preserve">“</w:t>
+      </w:r>
+      <w:r>
+        <w:t xml:space="preserve">material comprometido</w:t>
+      </w:r>
+      <w:r>
+        <w:t xml:space="preserve">”</w:t>
+      </w:r>
+      <w:r>
+        <w:t xml:space="preserve">? Que cautelas contratuais?</w:t>
+      </w:r>
+    </w:p>
+    <w:p>
+      <w:pPr>
+        <w:numPr>
+          <w:ilvl w:val="0"/>
+          <w:numId w:val="1007"/>
+        </w:numPr>
+        <w:pStyle w:val="Compact"/>
+      </w:pPr>
+      <w:r>
+        <w:t xml:space="preserve">Que condições gerais para fornecedores e pintores sobre os códigos (validade, uma obra por código, anulação)?</w:t>
+      </w:r>
+    </w:p>
+    <w:p>
+      <w:pPr>
+        <w:numPr>
+          <w:ilvl w:val="0"/>
+          <w:numId w:val="1007"/>
+        </w:numPr>
+        <w:pStyle w:val="Compact"/>
+      </w:pPr>
+      <w:r>
+        <w:t xml:space="preserve">Fiscal: IVA da comissão do fornecedor, e a retenção/faturação, a confirmar com contabilista.</w:t>
+      </w:r>
+    </w:p>
+    <w:bookmarkEnd w:id="27"/>
+    <w:bookmarkStart w:id="28" w:name="assinatura"/>
+    <w:p>
+      <w:pPr>
+        <w:pStyle w:val="Heading1"/>
+      </w:pPr>
+      <w:r>
         <w:t xml:space="preserve">7. Assinatura</w:t>
       </w:r>
     </w:p>
@@ -1302,7 +1471,7 @@
       <w:pPr>
         <w:numPr>
           <w:ilvl w:val="0"/>
-          <w:numId w:val="1007"/>
+          <w:numId w:val="1008"/>
         </w:numPr>
         <w:pStyle w:val="Compact"/>
       </w:pPr>
@@ -1336,7 +1505,7 @@
       <w:pPr>
         <w:numPr>
           <w:ilvl w:val="0"/>
-          <w:numId w:val="1007"/>
+          <w:numId w:val="1008"/>
         </w:numPr>
         <w:pStyle w:val="Compact"/>
       </w:pPr>
@@ -1354,8 +1523,8 @@
         <w:t xml:space="preserve">(E4): o PDF assinado passa a ter nomes, depois da apresentação. Confirmar.</w:t>
       </w:r>
     </w:p>
-    <w:bookmarkEnd w:id="27"/>
-    <w:bookmarkStart w:id="28" w:name="pedidos-de-documentos"/>
+    <w:bookmarkEnd w:id="28"/>
+    <w:bookmarkStart w:id="29" w:name="pedidos-de-documentos"/>
     <w:p>
       <w:pPr>
         <w:pStyle w:val="Heading1"/>
@@ -1438,7 +1607,7 @@
         <w:t xml:space="preserve">), página Transparência.</w:t>
       </w:r>
     </w:p>
-    <w:bookmarkEnd w:id="28"/>
+    <w:bookmarkEnd w:id="29"/>
     <w:sectPr/>
   </w:body>
 </w:document>
@@ -1814,6 +1983,36 @@
     </w:lvlOverride>
   </w:num>
   <w:num w:numId="1007">
+    <w:abstractNumId w:val="99411"/>
+    <w:lvlOverride w:ilvl="0">
+      <w:startOverride w:val="1"/>
+    </w:lvlOverride>
+    <w:lvlOverride w:ilvl="1">
+      <w:startOverride w:val="1"/>
+    </w:lvlOverride>
+    <w:lvlOverride w:ilvl="2">
+      <w:startOverride w:val="1"/>
+    </w:lvlOverride>
+    <w:lvlOverride w:ilvl="3">
+      <w:startOverride w:val="1"/>
+    </w:lvlOverride>
+    <w:lvlOverride w:ilvl="4">
+      <w:startOverride w:val="1"/>
+    </w:lvlOverride>
+    <w:lvlOverride w:ilvl="5">
+      <w:startOverride w:val="1"/>
+    </w:lvlOverride>
+    <w:lvlOverride w:ilvl="6">
+      <w:startOverride w:val="1"/>
+    </w:lvlOverride>
+    <w:lvlOverride w:ilvl="7">
+      <w:startOverride w:val="1"/>
+    </w:lvlOverride>
+    <w:lvlOverride w:ilvl="8">
+      <w:startOverride w:val="1"/>
+    </w:lvlOverride>
+  </w:num>
+  <w:num w:numId="1008">
     <w:abstractNumId w:val="99411"/>
     <w:lvlOverride w:ilvl="0">
       <w:startOverride w:val="1"/>

</xml_diff>